<commit_message>
import JVM articles from Zhihu and add cookie-based fetch script
</commit_message>
<xml_diff>
--- a/Java服务端简历 - 20260627.docx
+++ b/Java服务端简历 - 20260627.docx
@@ -5671,7 +5671,7 @@
           </mc:Choice>
           <mc:Fallback>
             <w:pict>
-              <v:rect id="Rectangle 3" o:spid="_x0000_s1026" o:spt="1" style="position:absolute;left:0pt;margin-left:94.9pt;margin-top:305.45pt;height:378pt;width:391.4pt;z-index:251686912;v-text-anchor:middle;mso-width-relative:page;mso-height-relative:page;" filled="f" stroked="f" coordsize="21600,21600" o:gfxdata="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">
+              <v:rect id="Rectangle 3" o:spid="_x0000_s1026" o:spt="1" style="position:absolute;left:0pt;margin-left:94.9pt;margin-top:305.45pt;height:378pt;width:391.4pt;z-index:251686912;v-text-anchor:middle;mso-width-relative:page;mso-height-relative:page;" filled="f" stroked="f" coordsize="21600,21600" o:gfxdata="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">
                 <v:fill on="f" focussize="0,0"/>
                 <v:stroke on="f"/>
                 <v:imagedata o:title=""/>
@@ -6940,7 +6940,7 @@
           </mc:Choice>
           <mc:Fallback>
             <w:pict>
-              <v:group id="_x0000_s1026" o:spid="_x0000_s1026" o:spt="203" style="position:absolute;left:0pt;margin-left:92.3pt;margin-top:270.3pt;height:20.4pt;width:382.05pt;z-index:251679744;mso-width-relative:page;mso-height-relative:page;" coordsize="4852035,259080" o:gfxdata="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">
+              <v:group id="_x0000_s1026" o:spid="_x0000_s1026" o:spt="203" style="position:absolute;left:0pt;margin-left:92.3pt;margin-top:270.3pt;height:20.4pt;width:382.05pt;z-index:251679744;mso-width-relative:page;mso-height-relative:page;" coordsize="4852035,259080" o:gfxdata="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">
                 <o:lock v:ext="edit" aspectratio="f"/>
                 <v:shape id="_x0000_s1026" o:spid="_x0000_s1026" o:spt="100" style="position:absolute;left:146050;top:0;flip:y;height:259080;width:4705985;v-text-anchor:middle;" fillcolor="#4A4E59" filled="t" stroked="f" coordsize="4706252,259229" o:gfxdata="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" path="m1770532,259229l4706252,259229,4706252,175455,2174549,175455,2074433,0,2072579,0,1770532,0,1072994,0,553294,0,0,0,142202,258866,415551,258866,1072994,258866,1770532,258866xe">
                   <v:path o:connectlocs="1770431,259080;4705985,259080;4705985,175354;2174425,175354;2074315,0;2072461,0;1770431,0;1072933,0;553262,0;0,0;142193,258717;415527,258717;1072933,258717;1770431,258717" o:connectangles="0,0,0,0,0,0,0,0,0,0,0,0,0,0"/>
@@ -7533,6 +7533,8 @@
           </mc:Fallback>
         </mc:AlternateContent>
       </w:r>
+      <w:bookmarkStart w:id="0" w:name="_GoBack"/>
+      <w:bookmarkEnd w:id="0"/>
       <w:r>
         <w:rPr>
           <w:rFonts w:ascii="Calibri" w:hAnsi="Calibri" w:eastAsia="宋体" w:cs="Times New Roman"/>
@@ -7717,7 +7719,7 @@
                               <w:spacing w:line="360" w:lineRule="exact"/>
                               <w:textAlignment w:val="baseline"/>
                               <w:rPr>
-                                <w:rFonts w:hint="default" w:ascii="微软雅黑" w:hAnsi="微软雅黑" w:eastAsia="微软雅黑"/>
+                                <w:rFonts w:hint="eastAsia" w:ascii="微软雅黑" w:hAnsi="微软雅黑" w:eastAsia="微软雅黑"/>
                                 <w:color w:val="FFFFFF"/>
                                 <w:kern w:val="24"/>
                                 <w:sz w:val="20"/>
@@ -7735,8 +7737,140 @@
                                 <w:lang w:val="en-US" w:eastAsia="zh-CN"/>
                               </w:rPr>
                               <w:tab/>
+                            </w:r>
+                            <w:r>
+                              <w:rPr>
+                                <w:rFonts w:hint="eastAsia" w:ascii="微软雅黑" w:hAnsi="微软雅黑" w:eastAsia="微软雅黑"/>
+                                <w:color w:val="FFFFFF"/>
+                                <w:kern w:val="24"/>
+                                <w:sz w:val="20"/>
+                                <w:szCs w:val="20"/>
+                                <w:lang w:val="en-US" w:eastAsia="zh-CN"/>
+                              </w:rPr>
                               <w:t>熟悉AI 开发工具使用</w:t>
                             </w:r>
+                          </w:p>
+                          <w:p>
+                            <w:pPr>
+                              <w:pStyle w:val="4"/>
+                              <w:tabs>
+                                <w:tab w:val="left" w:pos="420"/>
+                                <w:tab w:val="left" w:pos="1890"/>
+                                <w:tab w:val="left" w:pos="2100"/>
+                              </w:tabs>
+                              <w:spacing w:line="360" w:lineRule="exact"/>
+                              <w:textAlignment w:val="baseline"/>
+                              <w:rPr>
+                                <w:rFonts w:hint="eastAsia" w:ascii="微软雅黑" w:hAnsi="微软雅黑" w:eastAsia="微软雅黑"/>
+                                <w:color w:val="FFFFFF"/>
+                                <w:kern w:val="24"/>
+                                <w:sz w:val="20"/>
+                                <w:szCs w:val="20"/>
+                                <w:lang w:val="en-US" w:eastAsia="zh-CN"/>
+                              </w:rPr>
+                            </w:pPr>
+                          </w:p>
+                          <w:p>
+                            <w:pPr>
+                              <w:pStyle w:val="4"/>
+                              <w:tabs>
+                                <w:tab w:val="left" w:pos="420"/>
+                                <w:tab w:val="left" w:pos="1890"/>
+                                <w:tab w:val="left" w:pos="2100"/>
+                              </w:tabs>
+                              <w:spacing w:line="360" w:lineRule="exact"/>
+                              <w:textAlignment w:val="baseline"/>
+                              <w:rPr>
+                                <w:rFonts w:hint="eastAsia" w:ascii="微软雅黑" w:hAnsi="微软雅黑" w:eastAsia="微软雅黑"/>
+                                <w:color w:val="FFFFFF"/>
+                                <w:kern w:val="24"/>
+                                <w:sz w:val="20"/>
+                                <w:szCs w:val="20"/>
+                                <w:lang w:val="en-US" w:eastAsia="zh-CN"/>
+                              </w:rPr>
+                            </w:pPr>
+                            <w:r>
+                              <w:rPr>
+                                <w:rFonts w:hint="eastAsia" w:ascii="微软雅黑" w:hAnsi="微软雅黑" w:eastAsia="微软雅黑"/>
+                                <w:color w:val="FFFFFF"/>
+                                <w:kern w:val="24"/>
+                                <w:sz w:val="20"/>
+                                <w:szCs w:val="20"/>
+                                <w:lang w:val="en-US" w:eastAsia="zh-CN"/>
+                              </w:rPr>
+                              <w:t>个人知乎网站：</w:t>
+                            </w:r>
+                          </w:p>
+                          <w:p>
+                            <w:pPr>
+                              <w:pStyle w:val="4"/>
+                              <w:tabs>
+                                <w:tab w:val="left" w:pos="420"/>
+                                <w:tab w:val="left" w:pos="1890"/>
+                                <w:tab w:val="left" w:pos="2100"/>
+                              </w:tabs>
+                              <w:spacing w:line="360" w:lineRule="exact"/>
+                              <w:textAlignment w:val="baseline"/>
+                              <w:rPr>
+                                <w:rFonts w:hint="eastAsia" w:ascii="微软雅黑" w:hAnsi="微软雅黑" w:eastAsia="微软雅黑"/>
+                                <w:color w:val="FFFFFF"/>
+                                <w:kern w:val="24"/>
+                                <w:sz w:val="20"/>
+                                <w:szCs w:val="20"/>
+                                <w:lang w:val="en-US" w:eastAsia="zh-CN"/>
+                              </w:rPr>
+                            </w:pPr>
+                            <w:r>
+                              <w:rPr>
+                                <w:rFonts w:hint="eastAsia" w:ascii="微软雅黑" w:hAnsi="微软雅黑" w:eastAsia="微软雅黑"/>
+                                <w:color w:val="FFFFFF"/>
+                                <w:kern w:val="24"/>
+                                <w:sz w:val="20"/>
+                                <w:szCs w:val="20"/>
+                                <w:lang w:val="en-US" w:eastAsia="zh-CN"/>
+                              </w:rPr>
+                              <w:t>https://www.zhihu.com/people/li-bu-si-13-71</w:t>
+                            </w:r>
+                          </w:p>
+                          <w:p>
+                            <w:pPr>
+                              <w:pStyle w:val="4"/>
+                              <w:tabs>
+                                <w:tab w:val="left" w:pos="420"/>
+                                <w:tab w:val="left" w:pos="1890"/>
+                                <w:tab w:val="left" w:pos="2100"/>
+                              </w:tabs>
+                              <w:spacing w:line="360" w:lineRule="exact"/>
+                              <w:textAlignment w:val="baseline"/>
+                              <w:rPr>
+                                <w:rFonts w:hint="default" w:ascii="微软雅黑" w:hAnsi="微软雅黑" w:eastAsia="微软雅黑"/>
+                                <w:color w:val="FFFFFF"/>
+                                <w:kern w:val="24"/>
+                                <w:sz w:val="20"/>
+                                <w:szCs w:val="20"/>
+                                <w:lang w:val="en-US" w:eastAsia="zh-CN"/>
+                              </w:rPr>
+                            </w:pPr>
+                          </w:p>
+                          <w:p>
+                            <w:pPr>
+                              <w:pStyle w:val="4"/>
+                              <w:tabs>
+                                <w:tab w:val="left" w:pos="420"/>
+                                <w:tab w:val="left" w:pos="1890"/>
+                                <w:tab w:val="left" w:pos="2100"/>
+                              </w:tabs>
+                              <w:spacing w:line="360" w:lineRule="exact"/>
+                              <w:textAlignment w:val="baseline"/>
+                              <w:rPr>
+                                <w:rFonts w:hint="default" w:ascii="微软雅黑" w:hAnsi="微软雅黑" w:eastAsia="微软雅黑"/>
+                                <w:color w:val="FFFFFF"/>
+                                <w:kern w:val="24"/>
+                                <w:sz w:val="20"/>
+                                <w:szCs w:val="20"/>
+                                <w:lang w:val="en-US" w:eastAsia="zh-CN"/>
+                              </w:rPr>
+                            </w:pPr>
                           </w:p>
                         </w:txbxContent>
                       </wps:txbx>
@@ -7907,7 +8041,7 @@
                         <w:spacing w:line="360" w:lineRule="exact"/>
                         <w:textAlignment w:val="baseline"/>
                         <w:rPr>
-                          <w:rFonts w:hint="default" w:ascii="微软雅黑" w:hAnsi="微软雅黑" w:eastAsia="微软雅黑"/>
+                          <w:rFonts w:hint="eastAsia" w:ascii="微软雅黑" w:hAnsi="微软雅黑" w:eastAsia="微软雅黑"/>
                           <w:color w:val="FFFFFF"/>
                           <w:kern w:val="24"/>
                           <w:sz w:val="20"/>
@@ -7925,8 +8059,140 @@
                           <w:lang w:val="en-US" w:eastAsia="zh-CN"/>
                         </w:rPr>
                         <w:tab/>
+                      </w:r>
+                      <w:r>
+                        <w:rPr>
+                          <w:rFonts w:hint="eastAsia" w:ascii="微软雅黑" w:hAnsi="微软雅黑" w:eastAsia="微软雅黑"/>
+                          <w:color w:val="FFFFFF"/>
+                          <w:kern w:val="24"/>
+                          <w:sz w:val="20"/>
+                          <w:szCs w:val="20"/>
+                          <w:lang w:val="en-US" w:eastAsia="zh-CN"/>
+                        </w:rPr>
                         <w:t>熟悉AI 开发工具使用</w:t>
                       </w:r>
+                    </w:p>
+                    <w:p>
+                      <w:pPr>
+                        <w:pStyle w:val="4"/>
+                        <w:tabs>
+                          <w:tab w:val="left" w:pos="420"/>
+                          <w:tab w:val="left" w:pos="1890"/>
+                          <w:tab w:val="left" w:pos="2100"/>
+                        </w:tabs>
+                        <w:spacing w:line="360" w:lineRule="exact"/>
+                        <w:textAlignment w:val="baseline"/>
+                        <w:rPr>
+                          <w:rFonts w:hint="eastAsia" w:ascii="微软雅黑" w:hAnsi="微软雅黑" w:eastAsia="微软雅黑"/>
+                          <w:color w:val="FFFFFF"/>
+                          <w:kern w:val="24"/>
+                          <w:sz w:val="20"/>
+                          <w:szCs w:val="20"/>
+                          <w:lang w:val="en-US" w:eastAsia="zh-CN"/>
+                        </w:rPr>
+                      </w:pPr>
+                    </w:p>
+                    <w:p>
+                      <w:pPr>
+                        <w:pStyle w:val="4"/>
+                        <w:tabs>
+                          <w:tab w:val="left" w:pos="420"/>
+                          <w:tab w:val="left" w:pos="1890"/>
+                          <w:tab w:val="left" w:pos="2100"/>
+                        </w:tabs>
+                        <w:spacing w:line="360" w:lineRule="exact"/>
+                        <w:textAlignment w:val="baseline"/>
+                        <w:rPr>
+                          <w:rFonts w:hint="eastAsia" w:ascii="微软雅黑" w:hAnsi="微软雅黑" w:eastAsia="微软雅黑"/>
+                          <w:color w:val="FFFFFF"/>
+                          <w:kern w:val="24"/>
+                          <w:sz w:val="20"/>
+                          <w:szCs w:val="20"/>
+                          <w:lang w:val="en-US" w:eastAsia="zh-CN"/>
+                        </w:rPr>
+                      </w:pPr>
+                      <w:r>
+                        <w:rPr>
+                          <w:rFonts w:hint="eastAsia" w:ascii="微软雅黑" w:hAnsi="微软雅黑" w:eastAsia="微软雅黑"/>
+                          <w:color w:val="FFFFFF"/>
+                          <w:kern w:val="24"/>
+                          <w:sz w:val="20"/>
+                          <w:szCs w:val="20"/>
+                          <w:lang w:val="en-US" w:eastAsia="zh-CN"/>
+                        </w:rPr>
+                        <w:t>个人知乎网站：</w:t>
+                      </w:r>
+                    </w:p>
+                    <w:p>
+                      <w:pPr>
+                        <w:pStyle w:val="4"/>
+                        <w:tabs>
+                          <w:tab w:val="left" w:pos="420"/>
+                          <w:tab w:val="left" w:pos="1890"/>
+                          <w:tab w:val="left" w:pos="2100"/>
+                        </w:tabs>
+                        <w:spacing w:line="360" w:lineRule="exact"/>
+                        <w:textAlignment w:val="baseline"/>
+                        <w:rPr>
+                          <w:rFonts w:hint="eastAsia" w:ascii="微软雅黑" w:hAnsi="微软雅黑" w:eastAsia="微软雅黑"/>
+                          <w:color w:val="FFFFFF"/>
+                          <w:kern w:val="24"/>
+                          <w:sz w:val="20"/>
+                          <w:szCs w:val="20"/>
+                          <w:lang w:val="en-US" w:eastAsia="zh-CN"/>
+                        </w:rPr>
+                      </w:pPr>
+                      <w:r>
+                        <w:rPr>
+                          <w:rFonts w:hint="eastAsia" w:ascii="微软雅黑" w:hAnsi="微软雅黑" w:eastAsia="微软雅黑"/>
+                          <w:color w:val="FFFFFF"/>
+                          <w:kern w:val="24"/>
+                          <w:sz w:val="20"/>
+                          <w:szCs w:val="20"/>
+                          <w:lang w:val="en-US" w:eastAsia="zh-CN"/>
+                        </w:rPr>
+                        <w:t>https://www.zhihu.com/people/li-bu-si-13-71</w:t>
+                      </w:r>
+                    </w:p>
+                    <w:p>
+                      <w:pPr>
+                        <w:pStyle w:val="4"/>
+                        <w:tabs>
+                          <w:tab w:val="left" w:pos="420"/>
+                          <w:tab w:val="left" w:pos="1890"/>
+                          <w:tab w:val="left" w:pos="2100"/>
+                        </w:tabs>
+                        <w:spacing w:line="360" w:lineRule="exact"/>
+                        <w:textAlignment w:val="baseline"/>
+                        <w:rPr>
+                          <w:rFonts w:hint="default" w:ascii="微软雅黑" w:hAnsi="微软雅黑" w:eastAsia="微软雅黑"/>
+                          <w:color w:val="FFFFFF"/>
+                          <w:kern w:val="24"/>
+                          <w:sz w:val="20"/>
+                          <w:szCs w:val="20"/>
+                          <w:lang w:val="en-US" w:eastAsia="zh-CN"/>
+                        </w:rPr>
+                      </w:pPr>
+                    </w:p>
+                    <w:p>
+                      <w:pPr>
+                        <w:pStyle w:val="4"/>
+                        <w:tabs>
+                          <w:tab w:val="left" w:pos="420"/>
+                          <w:tab w:val="left" w:pos="1890"/>
+                          <w:tab w:val="left" w:pos="2100"/>
+                        </w:tabs>
+                        <w:spacing w:line="360" w:lineRule="exact"/>
+                        <w:textAlignment w:val="baseline"/>
+                        <w:rPr>
+                          <w:rFonts w:hint="default" w:ascii="微软雅黑" w:hAnsi="微软雅黑" w:eastAsia="微软雅黑"/>
+                          <w:color w:val="FFFFFF"/>
+                          <w:kern w:val="24"/>
+                          <w:sz w:val="20"/>
+                          <w:szCs w:val="20"/>
+                          <w:lang w:val="en-US" w:eastAsia="zh-CN"/>
+                        </w:rPr>
+                      </w:pPr>
                     </w:p>
                   </w:txbxContent>
                 </v:textbox>
@@ -7975,7 +8241,7 @@
                               <w:pStyle w:val="4"/>
                               <w:jc w:val="center"/>
                               <w:rPr>
-                                <w:rFonts w:ascii="微软雅黑" w:hAnsi="微软雅黑" w:eastAsia="微软雅黑"/>
+                                <w:rFonts w:hint="eastAsia" w:ascii="微软雅黑" w:hAnsi="微软雅黑" w:eastAsia="微软雅黑"/>
                                 <w:b/>
                                 <w:bCs/>
                                 <w:color w:val="FFFFFF"/>
@@ -7996,6 +8262,21 @@
                               </w:rPr>
                               <w:t>李俊</w:t>
                             </w:r>
+                          </w:p>
+                          <w:p>
+                            <w:pPr>
+                              <w:pStyle w:val="4"/>
+                              <w:jc w:val="center"/>
+                              <w:rPr>
+                                <w:rFonts w:hint="eastAsia" w:ascii="微软雅黑" w:hAnsi="微软雅黑" w:eastAsia="微软雅黑"/>
+                                <w:b/>
+                                <w:bCs/>
+                                <w:color w:val="FFFFFF"/>
+                                <w:kern w:val="24"/>
+                                <w:sz w:val="40"/>
+                                <w:szCs w:val="40"/>
+                              </w:rPr>
+                            </w:pPr>
                           </w:p>
                         </w:txbxContent>
                       </wps:txbx>
@@ -8022,7 +8303,7 @@
                         <w:pStyle w:val="4"/>
                         <w:jc w:val="center"/>
                         <w:rPr>
-                          <w:rFonts w:ascii="微软雅黑" w:hAnsi="微软雅黑" w:eastAsia="微软雅黑"/>
+                          <w:rFonts w:hint="eastAsia" w:ascii="微软雅黑" w:hAnsi="微软雅黑" w:eastAsia="微软雅黑"/>
                           <w:b/>
                           <w:bCs/>
                           <w:color w:val="FFFFFF"/>
@@ -8043,6 +8324,21 @@
                         </w:rPr>
                         <w:t>李俊</w:t>
                       </w:r>
+                    </w:p>
+                    <w:p>
+                      <w:pPr>
+                        <w:pStyle w:val="4"/>
+                        <w:jc w:val="center"/>
+                        <w:rPr>
+                          <w:rFonts w:hint="eastAsia" w:ascii="微软雅黑" w:hAnsi="微软雅黑" w:eastAsia="微软雅黑"/>
+                          <w:b/>
+                          <w:bCs/>
+                          <w:color w:val="FFFFFF"/>
+                          <w:kern w:val="24"/>
+                          <w:sz w:val="40"/>
+                          <w:szCs w:val="40"/>
+                        </w:rPr>
+                      </w:pPr>
                     </w:p>
                   </w:txbxContent>
                 </v:textbox>
@@ -8054,8 +8350,6 @@
       <w:r>
         <w:br w:type="page"/>
       </w:r>
-      <w:bookmarkStart w:id="0" w:name="_GoBack"/>
-      <w:bookmarkEnd w:id="0"/>
       <w:r>
         <w:rPr>
           <w:rFonts w:ascii="Calibri" w:hAnsi="Calibri" w:eastAsia="宋体" w:cs="Times New Roman"/>
@@ -9682,7 +9976,7 @@
           </mc:Choice>
           <mc:Fallback>
             <w:pict>
-              <v:rect id="_x0000_s1026" o:spid="_x0000_s1026" o:spt="1" style="position:absolute;left:0pt;margin-left:98.5pt;margin-top:7.5pt;height:804.5pt;width:387.35pt;z-index:251687936;mso-width-relative:page;mso-height-relative:page;" filled="f" stroked="f" coordsize="21600,21600" o:gfxdata="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">
+              <v:rect id="_x0000_s1026" o:spid="_x0000_s1026" o:spt="1" style="position:absolute;left:0pt;margin-left:98.5pt;margin-top:7.5pt;height:804.5pt;width:387.35pt;z-index:251687936;mso-width-relative:page;mso-height-relative:page;" filled="f" stroked="f" coordsize="21600,21600" o:gfxdata="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">
                 <v:fill on="f" focussize="0,0"/>
                 <v:stroke on="f"/>
                 <v:imagedata o:title=""/>
@@ -12682,7 +12976,7 @@
   <w:style w:type="paragraph" w:styleId="2">
     <w:name w:val="footer"/>
     <w:basedOn w:val="1"/>
-    <w:link w:val="8"/>
+    <w:link w:val="9"/>
     <w:unhideWhenUsed/>
     <w:uiPriority w:val="99"/>
     <w:pPr>
@@ -12701,7 +12995,7 @@
   <w:style w:type="paragraph" w:styleId="3">
     <w:name w:val="header"/>
     <w:basedOn w:val="1"/>
-    <w:link w:val="7"/>
+    <w:link w:val="8"/>
     <w:unhideWhenUsed/>
     <w:uiPriority w:val="99"/>
     <w:pPr>
@@ -12731,7 +13025,18 @@
       <w:szCs w:val="24"/>
     </w:rPr>
   </w:style>
-  <w:style w:type="character" w:customStyle="1" w:styleId="7">
+  <w:style w:type="character" w:styleId="7">
+    <w:name w:val="Hyperlink"/>
+    <w:basedOn w:val="6"/>
+    <w:semiHidden/>
+    <w:unhideWhenUsed/>
+    <w:uiPriority w:val="99"/>
+    <w:rPr>
+      <w:color w:val="0000FF"/>
+      <w:u w:val="single"/>
+    </w:rPr>
+  </w:style>
+  <w:style w:type="character" w:customStyle="1" w:styleId="8">
     <w:name w:val="页眉 字符"/>
     <w:basedOn w:val="6"/>
     <w:link w:val="3"/>
@@ -12741,7 +13046,7 @@
       <w:szCs w:val="18"/>
     </w:rPr>
   </w:style>
-  <w:style w:type="character" w:customStyle="1" w:styleId="8">
+  <w:style w:type="character" w:customStyle="1" w:styleId="9">
     <w:name w:val="页脚 字符"/>
     <w:basedOn w:val="6"/>
     <w:link w:val="2"/>

</xml_diff>